<commit_message>
Rewrite document text in plain, simple language
Shorter, everyday explanations instead of formal wording; keep Table 2
on one page.

Co-Authored-By: Claude Opus 5.5 <noreply@anthropic.com>
Claude-Session: https://claude.ai/code/session_01J7ZXBHKFjmZ4mZnZS1L8fG
</commit_message>
<xml_diff>
--- a/Техническа_документация.docx
+++ b/Техническа_документация.docx
@@ -186,7 +186,7 @@
         <w:rPr>
           <w:rtl w:val="0"/>
         </w:rPr>
-        <w:t xml:space="preserve">Одобреният бюджет по европейския проект за компютърна конфигурация е 4 688,00 €. Системата е проектирана като работна станция за 3D моделиране и рендериране в Blender, 3D сканиране и генериране на модели чрез изкуствен интелект.</w:t>
+        <w:t xml:space="preserve">Бюджетът ни по проекта е 4 688 €. Реших да направя компютър за 3D моделиране – да моделирам и рендерирам в Blender, да сканирам предмети и да правя модели с AI.</w:t>
       </w:r>
     </w:p>
     <w:p>
@@ -197,7 +197,7 @@
         <w:rPr>
           <w:rtl w:val="0"/>
         </w:rPr>
-        <w:t xml:space="preserve">Приоритет при разпределението на бюджета са видеокартата, оперативната памет и бързото дисково пространство. Всички цени са с ДДС и са базирани на оферти от онлайн магазини в България (октомври 2026 г.).</w:t>
+        <w:t xml:space="preserve">Най-много пари дадох за видеокартата, рамта и SSD-то, защото от тях зависи колко бързо върви всичко. Цените са с ДДС и са от български онлайн магазини (октомври 2026 г.).</w:t>
       </w:r>
       <w:r>
         <w:rPr>
@@ -225,7 +225,7 @@
         <w:rPr>
           <w:rtl w:val="0"/>
         </w:rPr>
-        <w:t xml:space="preserve">В Таблица 1 са посочени закупените компоненти, техните производители и цени, а след нея са изложени кратките технически обосновки за избора им.</w:t>
+        <w:t xml:space="preserve">В Таблица 1 са всички части, кой ги прави и колко струват. Под нея съм написал накратко защо съм избрал всяка.</w:t>
       </w:r>
       <w:r>
         <w:rPr>
@@ -5444,7 +5444,7 @@
         <w:rPr>
           <w:rtl w:val="0"/>
         </w:rPr>
-        <w:t xml:space="preserve"> – 12 ядра / 24 нишки (до 5,6 GHz). Добър баланс между цена и производителност спрямо по-скъпия 9950X. Платформата AM5 осигурява възможност за бъдещ ъпгрейд.</w:t>
+        <w:t xml:space="preserve"> – 12 ядра и 24 нишки, достатъчно бърз за моделиране и рендер, а е по-евтин от 9950X. На AM5 после може да се сложи по-нов процесор.</w:t>
       </w:r>
     </w:p>
     <w:p>
@@ -5469,7 +5469,7 @@
         <w:rPr>
           <w:rtl w:val="0"/>
         </w:rPr>
-        <w:t xml:space="preserve"> – 360 mm водно охлаждане за поддържане на стабилни честоти и ниски нива на шум при продължително рендериране.</w:t>
+        <w:t xml:space="preserve"> – водно охлаждане, за да не загрява процесорът при дълъг рендер и да е тихо.</w:t>
       </w:r>
     </w:p>
     <w:p>
@@ -5494,7 +5494,7 @@
         <w:rPr>
           <w:rtl w:val="0"/>
         </w:rPr>
-        <w:t xml:space="preserve"> – чипсет B850, поддръжка на PCIe 5.0 и Wi-Fi 7. Около 200 € по-евтина от модела с X870, а липсващият USB4 не ми е нужен за 3D работата.</w:t>
+        <w:t xml:space="preserve"> – има PCIe 5.0 и Wi-Fi 7. Взех B850 вместо X870, защото е с около 200 € по-евтина, а разликата не ми трябва.</w:t>
       </w:r>
     </w:p>
     <w:p>
@@ -5519,7 +5519,7 @@
         <w:rPr>
           <w:rtl w:val="0"/>
         </w:rPr>
-        <w:t xml:space="preserve"> – 2x32 GB за работа със сложни сцени, 4K текстури и сканирани 3D обекти. Заради поскъпването на DDR5 паметта е вторият най-скъп компонент, но 64 GB са задължителни за тежки сцени. Свободни 2 слота за бъдещо разширение.</w:t>
+        <w:t xml:space="preserve"> – 64 GB, за да не забива при големи сцени и сканирани модели. Рамта много поскъпна, но с по-малко няма да стига.</w:t>
       </w:r>
     </w:p>
     <w:p>
@@ -5544,7 +5544,7 @@
         <w:rPr>
           <w:rtl w:val="0"/>
         </w:rPr>
-        <w:t xml:space="preserve"> – ключов компонент за GPU рендериране в Blender (NVIDIA OptiX). Икономията спрямо RTX 5080 позволи закупуването на 3D скенер и AI абонамент.</w:t>
+        <w:t xml:space="preserve"> – повече VRAM (16 GB) за добър рендър и слайс. Рендерът в Blender върви на видеокартата. Взех нея вместо RTX 5080, за да останат пари за скенера.</w:t>
       </w:r>
     </w:p>
     <w:p>
@@ -5569,7 +5569,7 @@
         <w:rPr>
           <w:rtl w:val="0"/>
         </w:rPr>
-        <w:t xml:space="preserve"> – бързо NVMe M.2 (до 7250 MB/s) за операционната система, програмите и работните проекти. С около 50 € по-евтин от Samsung 990 PRO при почти същата скорост.</w:t>
+        <w:t xml:space="preserve"> – бърз диск за Windows, програмите и проектите, по които работя. По-евтин е от Samsung 990 PRO, а е почти толкова бърз.</w:t>
       </w:r>
     </w:p>
     <w:p>
@@ -5594,7 +5594,7 @@
         <w:rPr>
           <w:rtl w:val="0"/>
         </w:rPr>
-        <w:t xml:space="preserve"> – надежден твърд диск за непрекъсната работа, за архив и резервни копия на завършени проекти и сурови файлове.</w:t>
+        <w:t xml:space="preserve"> – голям диск за готовите проекти и за резервни копия.</w:t>
       </w:r>
     </w:p>
     <w:p>
@@ -5619,7 +5619,7 @@
         <w:rPr>
           <w:rtl w:val="0"/>
         </w:rPr>
-        <w:t xml:space="preserve"> – 850 W (80 PLUS Gold). Осигурява висока ефективност и достатъчен резерв при пикова консумация от около 560 W.</w:t>
+        <w:t xml:space="preserve"> – 850 W стигат с резерв, компютърът дърпа около 560 W.</w:t>
       </w:r>
     </w:p>
     <w:p>
@@ -5644,7 +5644,7 @@
         <w:rPr>
           <w:rtl w:val="0"/>
         </w:rPr>
-        <w:t xml:space="preserve"> – евтина кутия с мрежест преден панел и два вентилатора за добър въздушен поток и място за 360 mm радиатор.</w:t>
+        <w:t xml:space="preserve"> – евтина кутия с мрежа отпред и два вентилатора, влиза и водното охлаждане.</w:t>
       </w:r>
     </w:p>
     <w:p>
@@ -5669,7 +5669,7 @@
         <w:rPr>
           <w:rtl w:val="0"/>
         </w:rPr>
-        <w:t xml:space="preserve"> – 4K IPS дисплей (120 Hz, 99 % sRGB) с достатъчно точни цветове за текстуриране и голяма работна площ за интерфейса на Blender, на почти половин цена от серията UltraSharp.</w:t>
+        <w:t xml:space="preserve"> – 4K, за да има място за всички менюта на Blender, и с добри цветове за текстурите. Почти двойно по-евтин от UltraSharp.</w:t>
       </w:r>
     </w:p>
     <w:p>
@@ -5694,7 +5694,7 @@
         <w:rPr>
           <w:rtl w:val="0"/>
         </w:rPr>
-        <w:t xml:space="preserve"> – безжичен комплект клавиатура и мишка, напълно достатъчен за работа и със 125 € по-евтин от серията MX.</w:t>
+        <w:t xml:space="preserve"> – обикновен безжичен комплект, стига ми за работа.</w:t>
       </w:r>
     </w:p>
     <w:p>
@@ -5719,7 +5719,7 @@
         <w:rPr>
           <w:rtl w:val="0"/>
         </w:rPr>
-        <w:t xml:space="preserve"> – 1200 VA / 650 W, покрива консумацията на компютъра и монитора и пази от загуба на данни при спиране на тока по време на рендериране.</w:t>
+        <w:t xml:space="preserve"> – ако спре токът по време на рендер, да не загубя работата.</w:t>
       </w:r>
     </w:p>
     <w:p>
@@ -5744,7 +5744,7 @@
         <w:rPr>
           <w:rtl w:val="0"/>
         </w:rPr>
-        <w:t xml:space="preserve"> – точност до 0,1 mm с цветни текстури за дигитализация на физически обекти директно в Blender.</w:t>
+        <w:t xml:space="preserve"> – сканира истински предмети с точност до 0,1 mm и с цвят, после ги оправям в Blender.</w:t>
       </w:r>
     </w:p>
     <w:p>
@@ -5769,7 +5769,7 @@
         <w:rPr>
           <w:rtl w:val="0"/>
         </w:rPr>
-        <w:t xml:space="preserve"> – за пълна съвместимост с хардуерните драйвери и специализирания 3D софтуер.</w:t>
+        <w:t xml:space="preserve"> – лицензирана операционна система.</w:t>
       </w:r>
     </w:p>
     <w:p>
@@ -5794,7 +5794,7 @@
         <w:rPr>
           <w:rtl w:val="0"/>
         </w:rPr>
-        <w:t xml:space="preserve"> – генеративен AI софтуер за ускорено създаване на базови 3D модели и текстури от текст/изображения.</w:t>
+        <w:t xml:space="preserve"> – AI, който прави 3D модел от текст или снимка. Ползвам го за бързи чернови, после ги доработвам.</w:t>
       </w:r>
     </w:p>
     <w:p>
@@ -5832,7 +5832,7 @@
         <w:rPr>
           <w:rtl w:val="0"/>
         </w:rPr>
-        <w:t xml:space="preserve"> – професионален монтаж, инсталация и стрес-тестове за запазване на гаранцията.</w:t>
+        <w:t xml:space="preserve"> – магазинът го сглобява и тества, за да важи гаранцията.</w:t>
       </w:r>
       <w:r>
         <w:rPr>
@@ -5848,7 +5848,7 @@
         <w:rPr>
           <w:rtl w:val="0"/>
         </w:rPr>
-        <w:t xml:space="preserve">Програмата за моделиране Blender е безплатна, затова не съм предвидил пари за нея. Офис пакет не купих, защото не е нужен за 3D работата.</w:t>
+        <w:t xml:space="preserve">Blender е безплатен, затова не съм дал пари за програма за моделиране. Офис пакет не купих, защото не ми трябва.</w:t>
       </w:r>
       <w:r>
         <w:rPr>
@@ -5876,7 +5876,7 @@
         <w:rPr>
           <w:rtl w:val="0"/>
         </w:rPr>
-        <w:t xml:space="preserve">От общия бюджет са усвоени 4 612,61 € (98,39 %). Остатъкът от 75,39 € е резерв за доставка или за промяна на цените до покупката. Поради силното поскъпване на RAM паметта и SSD устройствата през 2026 г. избрах по-евтини дънна платка, монитор, кутия и периферия, за да запазя 64 GB памет, RTX 5070 Ti и 3D скенера. В Таблица 2 и Фигура 1 е представено разпределението по категории.</w:t>
+        <w:t xml:space="preserve">Похарчил съм 4 612,61 € от 4 688 € (98,39 %). Остават 75,39 € за доставка или ако някоя цена се вдигне. Рамта и SSD-тата много поскъпнаха, затова взех по-евтини дънна платка, монитор, кутия и клавиатура, за да мога да си позволя 64 GB рам, RTX 5070 Ti и скенера. В Таблица 2 и Фигура 1 се вижда за какво отиват парите.</w:t>
       </w:r>
       <w:r>
         <w:rPr>
@@ -6046,7 +6046,7 @@
           </w:tcPr>
           <w:p>
             <w:pPr>
-              <w:keepNext w:val="0"/>
+              <w:keepNext w:val="1"/>
               <w:keepLines w:val="0"/>
               <w:pageBreakBefore w:val="0"/>
               <w:widowControl w:val="1"/>
@@ -6122,7 +6122,7 @@
           </w:tcPr>
           <w:p>
             <w:pPr>
-              <w:keepNext w:val="0"/>
+              <w:keepNext w:val="1"/>
               <w:keepLines w:val="0"/>
               <w:pageBreakBefore w:val="0"/>
               <w:widowControl w:val="1"/>
@@ -6198,7 +6198,7 @@
           </w:tcPr>
           <w:p>
             <w:pPr>
-              <w:keepNext w:val="0"/>
+              <w:keepNext w:val="1"/>
               <w:keepLines w:val="0"/>
               <w:pageBreakBefore w:val="0"/>
               <w:widowControl w:val="1"/>
@@ -6279,7 +6279,7 @@
           </w:tcPr>
           <w:p>
             <w:pPr>
-              <w:keepNext w:val="0"/>
+              <w:keepNext w:val="1"/>
               <w:keepLines w:val="0"/>
               <w:pageBreakBefore w:val="0"/>
               <w:widowControl w:val="1"/>
@@ -6349,7 +6349,7 @@
           </w:tcPr>
           <w:p>
             <w:pPr>
-              <w:keepNext w:val="0"/>
+              <w:keepNext w:val="1"/>
               <w:keepLines w:val="0"/>
               <w:pageBreakBefore w:val="0"/>
               <w:widowControl w:val="1"/>
@@ -6423,7 +6423,7 @@
           </w:tcPr>
           <w:p>
             <w:pPr>
-              <w:keepNext w:val="0"/>
+              <w:keepNext w:val="1"/>
               <w:keepLines w:val="0"/>
               <w:pageBreakBefore w:val="0"/>
               <w:widowControl w:val="1"/>
@@ -6503,7 +6503,7 @@
           </w:tcPr>
           <w:p>
             <w:pPr>
-              <w:keepNext w:val="0"/>
+              <w:keepNext w:val="1"/>
               <w:keepLines w:val="0"/>
               <w:pageBreakBefore w:val="0"/>
               <w:widowControl w:val="1"/>
@@ -6573,7 +6573,7 @@
           </w:tcPr>
           <w:p>
             <w:pPr>
-              <w:keepNext w:val="0"/>
+              <w:keepNext w:val="1"/>
               <w:keepLines w:val="0"/>
               <w:pageBreakBefore w:val="0"/>
               <w:widowControl w:val="1"/>
@@ -6643,7 +6643,7 @@
           </w:tcPr>
           <w:p>
             <w:pPr>
-              <w:keepNext w:val="0"/>
+              <w:keepNext w:val="1"/>
               <w:keepLines w:val="0"/>
               <w:pageBreakBefore w:val="0"/>
               <w:widowControl w:val="1"/>
@@ -6723,7 +6723,7 @@
           </w:tcPr>
           <w:p>
             <w:pPr>
-              <w:keepNext w:val="0"/>
+              <w:keepNext w:val="1"/>
               <w:keepLines w:val="0"/>
               <w:pageBreakBefore w:val="0"/>
               <w:widowControl w:val="1"/>
@@ -6793,7 +6793,7 @@
           </w:tcPr>
           <w:p>
             <w:pPr>
-              <w:keepNext w:val="0"/>
+              <w:keepNext w:val="1"/>
               <w:keepLines w:val="0"/>
               <w:pageBreakBefore w:val="0"/>
               <w:widowControl w:val="1"/>
@@ -6863,7 +6863,7 @@
           </w:tcPr>
           <w:p>
             <w:pPr>
-              <w:keepNext w:val="0"/>
+              <w:keepNext w:val="1"/>
               <w:keepLines w:val="0"/>
               <w:pageBreakBefore w:val="0"/>
               <w:widowControl w:val="1"/>
@@ -6943,7 +6943,7 @@
           </w:tcPr>
           <w:p>
             <w:pPr>
-              <w:keepNext w:val="0"/>
+              <w:keepNext w:val="1"/>
               <w:keepLines w:val="0"/>
               <w:pageBreakBefore w:val="0"/>
               <w:widowControl w:val="1"/>
@@ -7013,7 +7013,7 @@
           </w:tcPr>
           <w:p>
             <w:pPr>
-              <w:keepNext w:val="0"/>
+              <w:keepNext w:val="1"/>
               <w:keepLines w:val="0"/>
               <w:pageBreakBefore w:val="0"/>
               <w:widowControl w:val="1"/>
@@ -7083,7 +7083,7 @@
           </w:tcPr>
           <w:p>
             <w:pPr>
-              <w:keepNext w:val="0"/>
+              <w:keepNext w:val="1"/>
               <w:keepLines w:val="0"/>
               <w:pageBreakBefore w:val="0"/>
               <w:widowControl w:val="1"/>
@@ -7163,7 +7163,7 @@
           </w:tcPr>
           <w:p>
             <w:pPr>
-              <w:keepNext w:val="0"/>
+              <w:keepNext w:val="1"/>
               <w:keepLines w:val="0"/>
               <w:pageBreakBefore w:val="0"/>
               <w:widowControl w:val="1"/>
@@ -7233,7 +7233,7 @@
           </w:tcPr>
           <w:p>
             <w:pPr>
-              <w:keepNext w:val="0"/>
+              <w:keepNext w:val="1"/>
               <w:keepLines w:val="0"/>
               <w:pageBreakBefore w:val="0"/>
               <w:widowControl w:val="1"/>
@@ -7307,7 +7307,7 @@
           </w:tcPr>
           <w:p>
             <w:pPr>
-              <w:keepNext w:val="0"/>
+              <w:keepNext w:val="1"/>
               <w:keepLines w:val="0"/>
               <w:pageBreakBefore w:val="0"/>
               <w:widowControl w:val="1"/>
@@ -7790,7 +7790,7 @@
         <w:rPr>
           <w:rtl w:val="0"/>
         </w:rPr>
-        <w:t xml:space="preserve">Основни принципи при бюджетното разпределение:</w:t>
+        <w:t xml:space="preserve">Защо съм разпределил парите така:</w:t>
       </w:r>
       <w:r>
         <w:rPr>
@@ -7814,13 +7814,13 @@
           <w:bCs w:val="1"/>
           <w:rtl w:val="0"/>
         </w:rPr>
-        <w:t xml:space="preserve">Фокус върху продуктивността</w:t>
+        <w:t xml:space="preserve">Най-важното първо</w:t>
       </w:r>
       <w:r>
         <w:rPr>
           <w:rtl w:val="0"/>
         </w:rPr>
-        <w:t xml:space="preserve"> – ресурсите са насочени главно към видеокартата, паметта и процесора.</w:t>
+        <w:t xml:space="preserve"> – най-много пари за видеокартата, рамта и процесора, защото от тях зависи скоростта.</w:t>
       </w:r>
     </w:p>
     <w:p>
@@ -7839,13 +7839,13 @@
           <w:bCs w:val="1"/>
           <w:rtl w:val="0"/>
         </w:rPr>
-        <w:t xml:space="preserve">Оптимизация на разходите</w:t>
+        <w:t xml:space="preserve">Спестяване</w:t>
       </w:r>
       <w:r>
         <w:rPr>
           <w:rtl w:val="0"/>
         </w:rPr>
-        <w:t xml:space="preserve"> – по-евтините дънна платка B850, монитор, кутия и периферия компенсират високите цени на паметта и позволиха 3D скенер, UPS и AI абонамент.</w:t>
+        <w:t xml:space="preserve"> – където по-евтиното върши същата работа, взех по-евтиното. Така останаха пари за скенера, UPS-а и AI абонамента.</w:t>
       </w:r>
     </w:p>
     <w:p>
@@ -7877,13 +7877,13 @@
           <w:bCs w:val="1"/>
           <w:rtl w:val="0"/>
         </w:rPr>
-        <w:t xml:space="preserve">Защита на данните</w:t>
+        <w:t xml:space="preserve">Данните</w:t>
       </w:r>
       <w:r>
         <w:rPr>
           <w:rtl w:val="0"/>
         </w:rPr>
-        <w:t xml:space="preserve"> – UPS при спиране на тока и отделен HDD за архив и резервни копия.</w:t>
+        <w:t xml:space="preserve"> – UPS, ако спре токът, и отделен диск за резервни копия.</w:t>
       </w:r>
       <w:r>
         <w:rPr>
@@ -7911,7 +7911,7 @@
         <w:rPr>
           <w:rtl w:val="0"/>
         </w:rPr>
-        <w:t xml:space="preserve">Конфигурацията представлява напълно функционална и балансирана работна станция за 3D моделиране, сканиране и рендериране, спазвайки стриктно финансовите рамки на проекта и осигурявайки възможност за бъдеща модернизация.</w:t>
+        <w:t xml:space="preserve">Направих работещ компютър за 3D моделиране, рендер и сканиране, без да надхвърля бюджета. По-нататък може да се ъпгрейдне с още рам или нов процесор.</w:t>
       </w:r>
       <w:r>
         <w:rPr>

</xml_diff>

<commit_message>
Set font sizes and justify body text
Body 12 pt justified, document title 14 pt, section headings 13 pt,
table/figure captions 12 pt.

Co-Authored-By: Claude Opus 5.5 <noreply@anthropic.com>
Claude-Session: https://claude.ai/code/session_01J7ZXBHKFjmZ4mZnZS1L8fG
</commit_message>
<xml_diff>
--- a/Техническа_документация.docx
+++ b/Техническа_документация.docx
@@ -28,8 +28,8 @@
           <w:smallCaps w:val="0"/>
           <w:strike w:val="0"/>
           <w:color w:val="000000"/>
-          <w:sz w:val="32"/>
-          <w:szCs w:val="32"/>
+          <w:sz w:val="28"/>
+          <w:szCs w:val="28"/>
           <w:u w:val="none"/>
           <w:shd w:fill="auto" w:val="clear"/>
           <w:vertAlign w:val="baseline"/>
@@ -45,8 +45,8 @@
           <w:smallCaps w:val="0"/>
           <w:strike w:val="0"/>
           <w:color w:val="000000"/>
-          <w:sz w:val="32"/>
-          <w:szCs w:val="32"/>
+          <w:sz w:val="28"/>
+          <w:szCs w:val="28"/>
           <w:u w:val="none"/>
           <w:shd w:fill="auto" w:val="clear"/>
           <w:vertAlign w:val="baseline"/>
@@ -191,6 +191,7 @@
     </w:p>
     <w:p>
       <w:pPr>
+        <w:jc w:val="both"/>
         <w:rPr/>
       </w:pPr>
       <w:r>
@@ -219,6 +220,7 @@
     </w:p>
     <w:p>
       <w:pPr>
+        <w:jc w:val="both"/>
         <w:rPr/>
       </w:pPr>
       <w:r>
@@ -259,8 +261,8 @@
           <w:smallCaps w:val="0"/>
           <w:strike w:val="0"/>
           <w:color w:val="000000"/>
-          <w:sz w:val="22"/>
-          <w:szCs w:val="22"/>
+          <w:sz w:val="24"/>
+          <w:szCs w:val="24"/>
           <w:u w:val="none"/>
           <w:shd w:fill="auto" w:val="clear"/>
           <w:vertAlign w:val="baseline"/>
@@ -276,8 +278,8 @@
           <w:smallCaps w:val="0"/>
           <w:strike w:val="0"/>
           <w:color w:val="000000"/>
-          <w:sz w:val="22"/>
-          <w:szCs w:val="22"/>
+          <w:sz w:val="24"/>
+          <w:szCs w:val="24"/>
           <w:u w:val="none"/>
           <w:shd w:fill="auto" w:val="clear"/>
           <w:vertAlign w:val="baseline"/>
@@ -295,8 +297,8 @@
           <w:smallCaps w:val="0"/>
           <w:strike w:val="0"/>
           <w:color w:val="000000"/>
-          <w:sz w:val="22"/>
-          <w:szCs w:val="22"/>
+          <w:sz w:val="24"/>
+          <w:szCs w:val="24"/>
           <w:u w:val="none"/>
           <w:shd w:fill="auto" w:val="clear"/>
           <w:vertAlign w:val="baseline"/>
@@ -314,8 +316,8 @@
           <w:smallCaps w:val="0"/>
           <w:strike w:val="0"/>
           <w:color w:val="000000"/>
-          <w:sz w:val="22"/>
-          <w:szCs w:val="22"/>
+          <w:sz w:val="24"/>
+          <w:szCs w:val="24"/>
           <w:u w:val="none"/>
           <w:shd w:fill="auto" w:val="clear"/>
           <w:vertAlign w:val="baseline"/>
@@ -333,8 +335,8 @@
           <w:smallCaps w:val="0"/>
           <w:strike w:val="0"/>
           <w:color w:val="000000"/>
-          <w:sz w:val="22"/>
-          <w:szCs w:val="22"/>
+          <w:sz w:val="24"/>
+          <w:szCs w:val="24"/>
           <w:u w:val="none"/>
           <w:shd w:fill="auto" w:val="clear"/>
           <w:vertAlign w:val="baseline"/>
@@ -5842,6 +5844,7 @@
     </w:p>
     <w:p>
       <w:pPr>
+        <w:jc w:val="both"/>
         <w:rPr/>
       </w:pPr>
       <w:r>
@@ -5870,6 +5873,7 @@
     </w:p>
     <w:p>
       <w:pPr>
+        <w:jc w:val="both"/>
         <w:rPr/>
       </w:pPr>
       <w:r>
@@ -5910,8 +5914,8 @@
           <w:smallCaps w:val="0"/>
           <w:strike w:val="0"/>
           <w:color w:val="000000"/>
-          <w:sz w:val="22"/>
-          <w:szCs w:val="22"/>
+          <w:sz w:val="24"/>
+          <w:szCs w:val="24"/>
           <w:u w:val="none"/>
           <w:shd w:fill="auto" w:val="clear"/>
           <w:vertAlign w:val="baseline"/>
@@ -5927,8 +5931,8 @@
           <w:smallCaps w:val="0"/>
           <w:strike w:val="0"/>
           <w:color w:val="000000"/>
-          <w:sz w:val="22"/>
-          <w:szCs w:val="22"/>
+          <w:sz w:val="24"/>
+          <w:szCs w:val="24"/>
           <w:u w:val="none"/>
           <w:shd w:fill="auto" w:val="clear"/>
           <w:vertAlign w:val="baseline"/>
@@ -5946,8 +5950,8 @@
           <w:smallCaps w:val="0"/>
           <w:strike w:val="0"/>
           <w:color w:val="000000"/>
-          <w:sz w:val="22"/>
-          <w:szCs w:val="22"/>
+          <w:sz w:val="24"/>
+          <w:szCs w:val="24"/>
           <w:u w:val="none"/>
           <w:shd w:fill="auto" w:val="clear"/>
           <w:vertAlign w:val="baseline"/>
@@ -5965,8 +5969,8 @@
           <w:smallCaps w:val="0"/>
           <w:strike w:val="0"/>
           <w:color w:val="000000"/>
-          <w:sz w:val="22"/>
-          <w:szCs w:val="22"/>
+          <w:sz w:val="24"/>
+          <w:szCs w:val="24"/>
           <w:u w:val="none"/>
           <w:shd w:fill="auto" w:val="clear"/>
           <w:vertAlign w:val="baseline"/>
@@ -5984,8 +5988,8 @@
           <w:smallCaps w:val="0"/>
           <w:strike w:val="0"/>
           <w:color w:val="000000"/>
-          <w:sz w:val="22"/>
-          <w:szCs w:val="22"/>
+          <w:sz w:val="24"/>
+          <w:szCs w:val="24"/>
           <w:u w:val="none"/>
           <w:shd w:fill="auto" w:val="clear"/>
           <w:vertAlign w:val="baseline"/>
@@ -7698,8 +7702,8 @@
           <w:smallCaps w:val="0"/>
           <w:strike w:val="0"/>
           <w:color w:val="000000"/>
-          <w:sz w:val="22"/>
-          <w:szCs w:val="22"/>
+          <w:sz w:val="24"/>
+          <w:szCs w:val="24"/>
           <w:u w:val="none"/>
           <w:shd w:fill="auto" w:val="clear"/>
           <w:vertAlign w:val="baseline"/>
@@ -7715,8 +7719,8 @@
           <w:smallCaps w:val="0"/>
           <w:strike w:val="0"/>
           <w:color w:val="000000"/>
-          <w:sz w:val="22"/>
-          <w:szCs w:val="22"/>
+          <w:sz w:val="24"/>
+          <w:szCs w:val="24"/>
           <w:u w:val="none"/>
           <w:shd w:fill="auto" w:val="clear"/>
           <w:vertAlign w:val="baseline"/>
@@ -7734,8 +7738,8 @@
           <w:smallCaps w:val="0"/>
           <w:strike w:val="0"/>
           <w:color w:val="000000"/>
-          <w:sz w:val="22"/>
-          <w:szCs w:val="22"/>
+          <w:sz w:val="24"/>
+          <w:szCs w:val="24"/>
           <w:u w:val="none"/>
           <w:shd w:fill="auto" w:val="clear"/>
           <w:vertAlign w:val="baseline"/>
@@ -7753,8 +7757,8 @@
           <w:smallCaps w:val="0"/>
           <w:strike w:val="0"/>
           <w:color w:val="000000"/>
-          <w:sz w:val="22"/>
-          <w:szCs w:val="22"/>
+          <w:sz w:val="24"/>
+          <w:szCs w:val="24"/>
           <w:u w:val="none"/>
           <w:shd w:fill="auto" w:val="clear"/>
           <w:vertAlign w:val="baseline"/>
@@ -7772,8 +7776,8 @@
           <w:smallCaps w:val="0"/>
           <w:strike w:val="0"/>
           <w:color w:val="000000"/>
-          <w:sz w:val="22"/>
-          <w:szCs w:val="22"/>
+          <w:sz w:val="24"/>
+          <w:szCs w:val="24"/>
           <w:u w:val="none"/>
           <w:shd w:fill="auto" w:val="clear"/>
           <w:vertAlign w:val="baseline"/>
@@ -7784,6 +7788,7 @@
     </w:p>
     <w:p>
       <w:pPr>
+        <w:jc w:val="both"/>
         <w:rPr/>
       </w:pPr>
       <w:r>
@@ -7905,6 +7910,7 @@
     </w:p>
     <w:p>
       <w:pPr>
+        <w:jc w:val="both"/>
         <w:rPr/>
       </w:pPr>
       <w:r>
@@ -8301,8 +8307,8 @@
       <w:rFonts w:ascii="Times New Roman" w:cs="Times New Roman" w:eastAsia="Times New Roman" w:hAnsi="Times New Roman"/>
       <w:b w:val="1"/>
       <w:bCs w:val="1"/>
-      <w:sz w:val="28"/>
-      <w:szCs w:val="28"/>
+      <w:sz w:val="26"/>
+      <w:szCs w:val="26"/>
     </w:rPr>
   </w:style>
   <w:style w:type="paragraph" w:styleId="Heading2">

</xml_diff>